<commit_message>
Se organiza extension de texto segun seleccion de termino de contrato, falta arreglar formato de texto
</commit_message>
<xml_diff>
--- a/CONTRATO DE TRABAJO INDEFINIDO.docx
+++ b/CONTRATO DE TRABAJO INDEFINIDO.docx
@@ -48,7 +48,7 @@
         </w:trPr>
         <w:tc>
           <w:tcPr>
-            <w:tcW w:w="3549" w:type="dxa"/>
+            <w:tcW w:w="3550" w:type="dxa"/>
             <w:gridSpan w:val="2"/>
             <w:tcBorders>
               <w:top w:val="single" w:sz="4" w:space="0" w:color="000000"/>
@@ -185,7 +185,7 @@
         </w:trPr>
         <w:tc>
           <w:tcPr>
-            <w:tcW w:w="3549" w:type="dxa"/>
+            <w:tcW w:w="3550" w:type="dxa"/>
             <w:gridSpan w:val="2"/>
             <w:tcBorders>
               <w:top w:val="single" w:sz="4" w:space="0" w:color="000000"/>
@@ -322,7 +322,7 @@
         </w:trPr>
         <w:tc>
           <w:tcPr>
-            <w:tcW w:w="3549" w:type="dxa"/>
+            <w:tcW w:w="3550" w:type="dxa"/>
             <w:gridSpan w:val="2"/>
             <w:tcBorders>
               <w:top w:val="single" w:sz="4" w:space="0" w:color="000000"/>
@@ -443,31 +443,12 @@
             </w:pPr>
             <w:r>
               <w:rPr>
-                <w:color w:val="FF0000"/>
-                <w:sz w:val="20"/>
-                <w:szCs w:val="20"/>
-              </w:rPr>
-              <w:t>[</w:t>
-            </w:r>
-            <w:proofErr w:type="spellStart"/>
-            <w:proofErr w:type="gramStart"/>
-            <w:r>
-              <w:rPr>
-                <w:color w:val="FF0000"/>
-                <w:sz w:val="20"/>
-                <w:szCs w:val="20"/>
-              </w:rPr>
-              <w:t>C.CNo</w:t>
-            </w:r>
-            <w:proofErr w:type="spellEnd"/>
-            <w:proofErr w:type="gramEnd"/>
-            <w:r>
-              <w:rPr>
-                <w:color w:val="FF0000"/>
-                <w:sz w:val="20"/>
-                <w:szCs w:val="20"/>
-              </w:rPr>
-              <w:t>]</w:t>
+                <w:color w:val="000000" w:themeColor="text1"/>
+                <w:sz w:val="20"/>
+                <w:szCs w:val="20"/>
+                <w:lang w:val="es-CO"/>
+              </w:rPr>
+              <w:t>[C.CT]</w:t>
             </w:r>
           </w:p>
         </w:tc>
@@ -479,7 +460,7 @@
         </w:trPr>
         <w:tc>
           <w:tcPr>
-            <w:tcW w:w="4956" w:type="dxa"/>
+            <w:tcW w:w="4957" w:type="dxa"/>
             <w:gridSpan w:val="3"/>
             <w:tcBorders>
               <w:top w:val="single" w:sz="4" w:space="0" w:color="000000"/>
@@ -596,7 +577,7 @@
         </w:trPr>
         <w:tc>
           <w:tcPr>
-            <w:tcW w:w="2556" w:type="dxa"/>
+            <w:tcW w:w="2557" w:type="dxa"/>
             <w:tcBorders>
               <w:top w:val="single" w:sz="4" w:space="0" w:color="000000"/>
               <w:left w:val="single" w:sz="4" w:space="0" w:color="000000"/>
@@ -668,7 +649,7 @@
         </w:trPr>
         <w:tc>
           <w:tcPr>
-            <w:tcW w:w="6081" w:type="dxa"/>
+            <w:tcW w:w="6082" w:type="dxa"/>
             <w:gridSpan w:val="4"/>
             <w:tcBorders>
               <w:top w:val="single" w:sz="4" w:space="0" w:color="000000"/>
@@ -740,7 +721,7 @@
         </w:trPr>
         <w:tc>
           <w:tcPr>
-            <w:tcW w:w="6081" w:type="dxa"/>
+            <w:tcW w:w="6082" w:type="dxa"/>
             <w:gridSpan w:val="4"/>
             <w:tcBorders>
               <w:top w:val="single" w:sz="4" w:space="0" w:color="000000"/>
@@ -813,7 +794,7 @@
         </w:trPr>
         <w:tc>
           <w:tcPr>
-            <w:tcW w:w="6081" w:type="dxa"/>
+            <w:tcW w:w="6082" w:type="dxa"/>
             <w:gridSpan w:val="4"/>
             <w:tcBorders>
               <w:top w:val="single" w:sz="4" w:space="0" w:color="000000"/>
@@ -888,7 +869,7 @@
         </w:trPr>
         <w:tc>
           <w:tcPr>
-            <w:tcW w:w="6081" w:type="dxa"/>
+            <w:tcW w:w="6082" w:type="dxa"/>
             <w:gridSpan w:val="4"/>
             <w:tcBorders>
               <w:top w:val="single" w:sz="4" w:space="0" w:color="000000"/>
@@ -981,7 +962,7 @@
         </w:trPr>
         <w:tc>
           <w:tcPr>
-            <w:tcW w:w="2556" w:type="dxa"/>
+            <w:tcW w:w="2557" w:type="dxa"/>
             <w:tcBorders>
               <w:top w:val="single" w:sz="4" w:space="0" w:color="000000"/>
               <w:left w:val="single" w:sz="4" w:space="0" w:color="000000"/>
@@ -1054,7 +1035,7 @@
         </w:trPr>
         <w:tc>
           <w:tcPr>
-            <w:tcW w:w="6081" w:type="dxa"/>
+            <w:tcW w:w="6082" w:type="dxa"/>
             <w:gridSpan w:val="4"/>
             <w:tcBorders>
               <w:top w:val="single" w:sz="4" w:space="0" w:color="000000"/>
@@ -1127,7 +1108,7 @@
         </w:trPr>
         <w:tc>
           <w:tcPr>
-            <w:tcW w:w="6081" w:type="dxa"/>
+            <w:tcW w:w="6082" w:type="dxa"/>
             <w:gridSpan w:val="4"/>
             <w:tcBorders>
               <w:top w:val="single" w:sz="4" w:space="0" w:color="000000"/>
@@ -1198,7 +1179,7 @@
         </w:trPr>
         <w:tc>
           <w:tcPr>
-            <w:tcW w:w="6081" w:type="dxa"/>
+            <w:tcW w:w="6082" w:type="dxa"/>
             <w:gridSpan w:val="4"/>
             <w:tcBorders>
               <w:left w:val="single" w:sz="4" w:space="0" w:color="000000"/>
@@ -1267,7 +1248,76 @@
         </w:trPr>
         <w:tc>
           <w:tcPr>
-            <w:tcW w:w="6081" w:type="dxa"/>
+            <w:tcW w:w="6082" w:type="dxa"/>
+            <w:gridSpan w:val="4"/>
+            <w:tcBorders>
+              <w:left w:val="single" w:sz="4" w:space="0" w:color="000000"/>
+              <w:bottom w:val="single" w:sz="4" w:space="0" w:color="000000"/>
+              <w:right w:val="single" w:sz="4" w:space="0" w:color="000000"/>
+            </w:tcBorders>
+            <w:shd w:val="clear" w:color="auto" w:fill="E4E4E4"/>
+            <w:vAlign w:val="center"/>
+          </w:tcPr>
+          <w:p>
+            <w:pPr>
+              <w:pStyle w:val="TableParagraph"/>
+              <w:ind w:left="0"/>
+              <w:rPr>
+                <w:b/>
+                <w:color w:val="000000" w:themeColor="text1"/>
+                <w:sz w:val="20"/>
+                <w:szCs w:val="20"/>
+              </w:rPr>
+            </w:pPr>
+            <w:r>
+              <w:rPr>
+                <w:b/>
+                <w:color w:val="000000" w:themeColor="text1"/>
+                <w:sz w:val="20"/>
+                <w:szCs w:val="20"/>
+              </w:rPr>
+              <w:t>DURACIÓN DEL PERÍODO DE PRUEBA (EN DÍAS)</w:t>
+            </w:r>
+          </w:p>
+        </w:tc>
+        <w:tc>
+          <w:tcPr>
+            <w:tcW w:w="3846" w:type="dxa"/>
+            <w:gridSpan w:val="3"/>
+            <w:tcBorders>
+              <w:left w:val="single" w:sz="4" w:space="0" w:color="000000"/>
+              <w:bottom w:val="single" w:sz="4" w:space="0" w:color="000000"/>
+              <w:right w:val="single" w:sz="4" w:space="0" w:color="000000"/>
+            </w:tcBorders>
+            <w:vAlign w:val="center"/>
+          </w:tcPr>
+          <w:p>
+            <w:pPr>
+              <w:pStyle w:val="TableParagraph"/>
+              <w:ind w:left="0"/>
+              <w:rPr>
+                <w:sz w:val="20"/>
+                <w:szCs w:val="20"/>
+              </w:rPr>
+            </w:pPr>
+            <w:r>
+              <w:rPr>
+                <w:sz w:val="20"/>
+                <w:szCs w:val="20"/>
+              </w:rPr>
+              <w:t>[PERIODO_PRUEBA]</w:t>
+            </w:r>
+          </w:p>
+        </w:tc>
+      </w:tr>
+      <w:tr>
+        <w:trPr>
+          <w:trHeight w:val="291"/>
+          <w:jc w:val="center"/>
+        </w:trPr>
+        <w:tc>
+          <w:tcPr>
+            <w:tcW w:w="6082" w:type="dxa"/>
             <w:gridSpan w:val="4"/>
             <w:tcBorders>
               <w:left w:val="single" w:sz="4" w:space="0" w:color="000000"/>
@@ -1337,7 +1387,7 @@
         </w:trPr>
         <w:tc>
           <w:tcPr>
-            <w:tcW w:w="6081" w:type="dxa"/>
+            <w:tcW w:w="6082" w:type="dxa"/>
             <w:gridSpan w:val="4"/>
             <w:tcBorders>
               <w:top w:val="single" w:sz="4" w:space="0" w:color="000000"/>
@@ -1409,7 +1459,7 @@
         </w:trPr>
         <w:tc>
           <w:tcPr>
-            <w:tcW w:w="6081" w:type="dxa"/>
+            <w:tcW w:w="6082" w:type="dxa"/>
             <w:gridSpan w:val="4"/>
             <w:tcBorders>
               <w:top w:val="single" w:sz="4" w:space="0" w:color="000000"/>
@@ -1731,7 +1781,15 @@
           <w:sz w:val="18"/>
           <w:szCs w:val="18"/>
         </w:rPr>
-        <w:t xml:space="preserve"> los horarios establecidos, las instrucciones de su jefe directo, y concurrir a las reuniones y conferencias para las cuales haya sido citado. 5. Rendir informe escrito cuando lo solicite la empresa. 6. Estar permanentemente actualizado en todas las normas, políticas y procedimientos que hacen parte de los diferentes procesos o subprocesos de la compañía. 7. Adoptar como norma de trabajo la más estricta veracidad para con los clientes, cumplir sus compromisos con diligencia y cuidado, guardar conducta intachable; en todas las actividades y una excelente presentación personal. 8. Atender efectivamente las solicitudes del cliente, e informar cualquier irregularidad la empresa. 9. Asistir a las capacitaciones a las que sea enviado por </w:t>
+        <w:t xml:space="preserve"> los horarios establecidos, las instrucciones de su jefe directo, y concurrir a las reuniones y conferencias para las cuales haya sido citado. 5. Rendir informe escrito cuando lo solicite la empresa. 6. Estar permanentemente actualizado en todas las normas, políticas y procedimientos que hacen parte de los diferentes procesos o subprocesos de la compañía. 7. Adoptar como norma de trabajo la más estricta veracidad para con los clientes, cumplir sus compromisos con diligencia y cuidado, guardar conducta intachable; en todas las actividades y una excelente presentación personal. 8. Atender </w:t>
+      </w:r>
+      <w:r>
+        <w:rPr>
+          <w:sz w:val="18"/>
+          <w:szCs w:val="18"/>
+        </w:rPr>
+        <w:lastRenderedPageBreak/>
+        <w:t xml:space="preserve">efectivamente las solicitudes del cliente, e informar cualquier irregularidad la empresa. 9. Asistir a las capacitaciones a las que sea enviado por </w:t>
       </w:r>
       <w:r>
         <w:rPr>
@@ -1746,15 +1804,7 @@
           <w:sz w:val="18"/>
           <w:szCs w:val="18"/>
         </w:rPr>
-        <w:t xml:space="preserve"> y presentarlos exámenes de validación de conocimiento a que ello conlleve. 10. </w:t>
-      </w:r>
-      <w:r>
-        <w:rPr>
-          <w:sz w:val="18"/>
-          <w:szCs w:val="18"/>
-        </w:rPr>
-        <w:lastRenderedPageBreak/>
-        <w:t xml:space="preserve">Cumplir las normas y procedimientos que sean adoptados en la organización para la prevención del lavado de activos. 11. Observar las normas que sobre conflicto de intereses tiene establecido la empresa y se abstendrá de tomar decisiones que puedan afectar la objetividad de </w:t>
+        <w:t xml:space="preserve"> y presentarlos exámenes de validación de conocimiento a que ello conlleve. 10. Cumplir las normas y procedimientos que sean adoptados en la organización para la prevención del lavado de activos. 11. Observar las normas que sobre conflicto de intereses tiene establecido la empresa y se abstendrá de tomar decisiones que puedan afectar la objetividad de </w:t>
       </w:r>
       <w:proofErr w:type="gramStart"/>
       <w:r>
@@ -2526,7 +2576,7 @@
           <w:sz w:val="18"/>
           <w:szCs w:val="18"/>
         </w:rPr>
-        <w:t xml:space="preserve">Guardar total confidencialidad en los asuntos internos de la empresa como: información de clientes, valores de facturación, manejo de insumos y materiales, procedimientos de trabajo técnico y operativo del servicio, información de los compañeros de trabajo y cualquier otra información de índole laboral y financiera que por el </w:t>
+        <w:t xml:space="preserve">Guardar total confidencialidad en los asuntos internos de la empresa como: información de clientes, valores de facturación, manejo de insumos y materiales, procedimientos de trabajo técnico y operativo del servicio, </w:t>
       </w:r>
       <w:r>
         <w:rPr>
@@ -2535,7 +2585,7 @@
           <w:szCs w:val="18"/>
         </w:rPr>
         <w:lastRenderedPageBreak/>
-        <w:t>desempeño de su cargo conozca y sea de propiedad de la organización.</w:t>
+        <w:t>información de los compañeros de trabajo y cualquier otra información de índole laboral y financiera que por el desempeño de su cargo conozca y sea de propiedad de la organización.</w:t>
       </w:r>
     </w:p>
     <w:p>
@@ -3001,56 +3051,72 @@
           <w:sz w:val="18"/>
           <w:szCs w:val="18"/>
         </w:rPr>
-        <w:t>tendrá vigencia a partir del 2 de octubre de 2023.</w:t>
-      </w:r>
-    </w:p>
-    <w:p>
-      <w:pPr>
-        <w:pStyle w:val="Textoindependiente"/>
-        <w:spacing w:line="290" w:lineRule="auto"/>
-        <w:jc w:val="both"/>
+        <w:t xml:space="preserve">tendrá vigencia a partir del </w:t>
+      </w:r>
+      <w:r>
         <w:rPr>
           <w:color w:val="FF0000"/>
           <w:sz w:val="18"/>
           <w:szCs w:val="18"/>
         </w:rPr>
-      </w:pPr>
+        <w:t>[FECHA_INICIO]</w:t>
+      </w:r>
       <w:r>
         <w:rPr>
           <w:color w:val="FF0000"/>
           <w:sz w:val="18"/>
           <w:szCs w:val="18"/>
         </w:rPr>
+        <w:t>.</w:t>
+      </w:r>
+    </w:p>
+    <w:p>
+      <w:pPr>
+        <w:pStyle w:val="Textoindependiente"/>
+        <w:spacing w:line="290" w:lineRule="auto"/>
+        <w:jc w:val="both"/>
+        <w:rPr>
+          <w:color w:val="FFFFFF" w:themeColor="background1"/>
+          <w:sz w:val="18"/>
+          <w:szCs w:val="18"/>
+        </w:rPr>
+      </w:pPr>
+      <w:r>
+        <w:rPr>
+          <w:color w:val="FFFFFF" w:themeColor="background1"/>
+          <w:sz w:val="18"/>
+          <w:szCs w:val="18"/>
+        </w:rPr>
         <w:t>[EXT_OBRA</w:t>
       </w:r>
       <w:r>
         <w:rPr>
+          <w:color w:val="FFFFFF" w:themeColor="background1"/>
+          <w:sz w:val="18"/>
+          <w:szCs w:val="18"/>
+        </w:rPr>
+        <w:t>_LABOR</w:t>
+      </w:r>
+      <w:r>
+        <w:rPr>
+          <w:color w:val="FFFFFF" w:themeColor="background1"/>
+          <w:sz w:val="18"/>
+          <w:szCs w:val="18"/>
+        </w:rPr>
+        <w:t>]</w:t>
+      </w:r>
+    </w:p>
+    <w:p>
+      <w:pPr>
+        <w:pStyle w:val="Textoindependiente"/>
+        <w:spacing w:line="290" w:lineRule="auto"/>
+        <w:jc w:val="both"/>
+        <w:rPr>
+          <w:b/>
           <w:color w:val="FF0000"/>
           <w:sz w:val="18"/>
           <w:szCs w:val="18"/>
         </w:rPr>
-        <w:t>_LABOR</w:t>
-      </w:r>
-      <w:r>
-        <w:rPr>
-          <w:color w:val="FF0000"/>
-          <w:sz w:val="18"/>
-          <w:szCs w:val="18"/>
-        </w:rPr>
-        <w:t>]</w:t>
-      </w:r>
-    </w:p>
-    <w:p>
-      <w:pPr>
-        <w:pStyle w:val="Textoindependiente"/>
-        <w:spacing w:line="290" w:lineRule="auto"/>
-        <w:jc w:val="both"/>
-        <w:rPr>
-          <w:b/>
-          <w:color w:val="FF0000"/>
-          <w:sz w:val="18"/>
-          <w:szCs w:val="18"/>
-        </w:rPr>
       </w:pPr>
       <w:r>
         <w:rPr>
@@ -3072,7 +3138,15 @@
           <w:sz w:val="18"/>
           <w:szCs w:val="18"/>
         </w:rPr>
-        <w:t xml:space="preserve"> que la labor contratada implica el desarrollo de tareas diversas que deben cumplirse progresivamente y por etapas y en distintos frentes de trabajo; razón por la cual cada una de las diferentes labores o etapas que forman parte de la labor citada puede empezar, funcionar y terminar independientemente de las demás y para cada una de ellas necesita </w:t>
+        <w:t xml:space="preserve"> que la labor contratada implica el desarrollo de tareas diversas que deben cumplirse progresivamente y por etapas y en distintos frentes de trabajo; razón por la cual cada una de las diferentes labores o etapas que forman parte de la labor citada puede empezar, funcionar y terminar independientemente de las demás y para cada una </w:t>
+      </w:r>
+      <w:r>
+        <w:rPr>
+          <w:sz w:val="18"/>
+          <w:szCs w:val="18"/>
+        </w:rPr>
+        <w:lastRenderedPageBreak/>
+        <w:t xml:space="preserve">de ellas necesita </w:t>
       </w:r>
       <w:r>
         <w:rPr>
@@ -3087,15 +3161,7 @@
           <w:sz w:val="18"/>
           <w:szCs w:val="18"/>
         </w:rPr>
-        <w:t xml:space="preserve"> personal calificado y diverso de acuerdo con la naturaleza de la obra o unidad que debe </w:t>
-      </w:r>
-      <w:r>
-        <w:rPr>
-          <w:sz w:val="18"/>
-          <w:szCs w:val="18"/>
-        </w:rPr>
-        <w:lastRenderedPageBreak/>
-        <w:t>efectuarse o desarrollarse.</w:t>
+        <w:t xml:space="preserve"> personal calificado y diverso de acuerdo con la naturaleza de la obra o unidad que debe efectuarse o desarrollarse.</w:t>
       </w:r>
     </w:p>
     <w:p>
@@ -3616,7 +3682,16 @@
           <w:szCs w:val="18"/>
           <w:lang w:val="es-CO"/>
         </w:rPr>
-        <w:t xml:space="preserve"> el descanso y alimentación no serán computados dentro de la jornada de trabajo.</w:t>
+        <w:t xml:space="preserve"> el </w:t>
+      </w:r>
+      <w:r>
+        <w:rPr>
+          <w:sz w:val="18"/>
+          <w:szCs w:val="18"/>
+          <w:lang w:val="es-CO"/>
+        </w:rPr>
+        <w:lastRenderedPageBreak/>
+        <w:t>descanso y alimentación no serán computados dentro de la jornada de trabajo.</w:t>
       </w:r>
     </w:p>
     <w:p>
@@ -3850,7 +3925,7 @@
           <w:szCs w:val="18"/>
           <w:lang w:val="es-CO"/>
         </w:rPr>
-        <w:t xml:space="preserve">. 14) Utilizar directa o indirectamente los bienes de la Empresa, en provecho propio o ajeno, tales como vehículos, locales, herramientas, entre otros, 15) Ejercer las actividades laborales en establecimientos o zonas distintas a las autorizadas. 16) Conceder descuentos, plazos, precios y condiciones diferentes a las autorizadas por la Empresa. 17). EI incumplimiento de los procedimientos contemplados en el Manual de Responsabilidades y de las órdenes, instrucciones o prohibiciones  de carácter general o particular.18) La inclusión de software o paquetes de informática en los equipos de EL EMPLEADOR, falta esta que no sólo ocasionará la terminación del contrato de trabajo con justa causa, sino que además, serán de su estricta responsabilidad todos los perjuicios que cause a EL EMPLEADOR y responderá aun penalmente por su acción en los términos de la Ley 44 de 1.993. 19) Que EL TRABAJADOR entregue o envíe información suministrada por los CLIENTES a terceros o personas no autorizadas. 20) No adoptar como norma de trabajo la más estricta veracidad para con los clientes, no cumplir sus compromisos con diligencia y cuidado, no guardar conducta intachable en todas las actividades comerciales y las políticas de la Gerencia Comercial relaciona con la gestión comercial que desempeña. 21) La presentación de cualquier documento falso, u obtenido indebidamente. 22) Desacreditar en alguna forma al EMPLEADOR, con manifestaciones o actos encaminados a tal fin. 23) Desatender o negarse a cumplir medidas de control establecidas por EL EMPLEADOR para </w:t>
+        <w:t xml:space="preserve">. 14) Utilizar directa o indirectamente los bienes de la Empresa, en provecho propio o ajeno, tales como vehículos, locales, herramientas, entre otros, 15) Ejercer las actividades laborales en establecimientos o zonas distintas a las autorizadas. 16) Conceder descuentos, plazos, precios y condiciones diferentes a las autorizadas por la Empresa. 17). EI incumplimiento de los procedimientos contemplados en el Manual de Responsabilidades y de las órdenes, instrucciones o prohibiciones  de carácter general o particular.18) La inclusión de software o paquetes de informática en los equipos de EL EMPLEADOR, falta esta que no sólo ocasionará la terminación del contrato de trabajo con justa causa, sino que además, serán de su estricta responsabilidad todos los perjuicios que cause a EL EMPLEADOR y responderá aun penalmente por su acción en los términos de la Ley 44 de 1.993. 19) Que EL TRABAJADOR entregue o envíe información suministrada por los CLIENTES a terceros o personas no autorizadas. 20) No adoptar como norma de trabajo la más estricta veracidad para con los clientes, no cumplir sus compromisos con diligencia y cuidado, no guardar conducta intachable en todas las actividades comerciales y las políticas de la Gerencia Comercial relaciona con la gestión comercial que desempeña. 21) La presentación de cualquier documento falso, u obtenido indebidamente. 22) Desacreditar en alguna forma al EMPLEADOR, con manifestaciones o actos </w:t>
       </w:r>
       <w:r>
         <w:rPr>
@@ -3859,7 +3934,7 @@
           <w:lang w:val="es-CO"/>
         </w:rPr>
         <w:lastRenderedPageBreak/>
-        <w:t xml:space="preserve">prevenir accidentes, hurtos, estafas, o cualquier otro ilícito que puedan atentar contra el patrimonio de la empresa.  24) La presentación de afiliaciones o incapacidades falsas o fraudulentas o con obtención indebida. 25) La inobservancia de las recomendaciones realizadas por los clientes del empleador o sus representantes para la prestación del servicio. 26) </w:t>
+        <w:t xml:space="preserve">encaminados a tal fin. 23) Desatender o negarse a cumplir medidas de control establecidas por EL EMPLEADOR para prevenir accidentes, hurtos, estafas, o cualquier otro ilícito que puedan atentar contra el patrimonio de la empresa.  24) La presentación de afiliaciones o incapacidades falsas o fraudulentas o con obtención indebida. 25) La inobservancia de las recomendaciones realizadas por los clientes del empleador o sus representantes para la prestación del servicio. 26) </w:t>
       </w:r>
       <w:r>
         <w:rPr>
@@ -4235,7 +4310,7 @@
           <w:lang w:val="es-CO"/>
         </w:rPr>
         <w:softHyphen/>
-        <w:t xml:space="preserve"> se extienden a mensaje de datos (Internet, EDI, correo electrónico entre otros), y en general a cualquier medio electrónico, óptico, magnético o similar, y en general a cualquier forma de utilización, reproducción o definición, conocido o por conocer. 3) Los derechos patrimoniales, económicos o de explotación sobre Patentes de Modelo de Utilidad, procesos, obras académicas , métodos de enseñanza , procesos y métodos de mercadeo y servicio al cliente, Diseños Industriales, Marcas de Productos o Servicios;' Marcas Colectivas, Marcas de Certificación, Lemas Comerciales, Nombre y Enseña Comerciales, indicaciones Geográficas, Denominación de Origen, Indicadores de Procedencia, Informaciones Confidenciales, Secretos Empresariales, Aquellos documentos académicos- comerciales, incluyendo de manera enunciativa, no taxativa, las obras académicas, métodos de enseñanza, procedimientos, técnicas, Know-How y demás  información general correspondiente a </w:t>
+        <w:t xml:space="preserve"> se extienden a mensaje de datos (Internet, EDI, correo electrónico entre otros), y en general a cualquier medio electrónico, óptico, magnético o similar, y en general a cualquier forma de utilización, reproducción o definición, conocido o por conocer. 3) Los derechos patrimoniales, económicos o de explotación sobre Patentes de Modelo de Utilidad, procesos, obras académicas , métodos de enseñanza , procesos y métodos de mercadeo y servicio al cliente, Diseños Industriales, Marcas de Productos o Servicios;' Marcas Colectivas, Marcas de Certificación, Lemas Comerciales, Nombre y Enseña Comerciales, indicaciones Geográficas, Denominación de Origen, Indicadores de Procedencia, Informaciones Confidenciales, Secretos Empresariales, Aquellos documentos académicos- comerciales, incluyendo de manera enunciativa, no taxativa, las obras </w:t>
       </w:r>
       <w:r>
         <w:rPr>
@@ -4244,7 +4319,7 @@
           <w:lang w:val="es-CO"/>
         </w:rPr>
         <w:lastRenderedPageBreak/>
-        <w:t xml:space="preserve">las características, naturaleza o finalidades de un producto, método o proceso de producción; sus formas o canales de distribución o comercialización, incluyendo su presentación, algoritmos, fórmulas, diagramas, planos, procesos, técnicas, diseños, fotografías, registros, compilaciones, información de clientes o interna de los contratantes y, en general, toda aquella información que esté relacionada con  programas, inventos, marcas, patentes, nombres comerciales, secretos industriales, y derechos de propiedad industrial o intelectual, licencias y cualquier otra información oral o escrita. </w:t>
+        <w:t xml:space="preserve">académicas, métodos de enseñanza, procedimientos, técnicas, Know-How y demás  información general correspondiente a las características, naturaleza o finalidades de un producto, método o proceso de producción; sus formas o canales de distribución o comercialización, incluyendo su presentación, algoritmos, fórmulas, diagramas, planos, procesos, técnicas, diseños, fotografías, registros, compilaciones, información de clientes o interna de los contratantes y, en general, toda aquella información que esté relacionada con  programas, inventos, marcas, patentes, nombres comerciales, secretos industriales, y derechos de propiedad industrial o intelectual, licencias y cualquier otra información oral o escrita. </w:t>
       </w:r>
     </w:p>
     <w:p>
@@ -4622,6 +4697,7 @@
           <w:szCs w:val="18"/>
           <w:lang w:val="es-CO"/>
         </w:rPr>
+        <w:lastRenderedPageBreak/>
         <w:t>PARÁGRAFO SEGUNDO:</w:t>
       </w:r>
       <w:r>
@@ -4630,16 +4706,7 @@
           <w:szCs w:val="18"/>
           <w:lang w:val="es-CO"/>
         </w:rPr>
-        <w:t xml:space="preserve"> La presente cláusula de Confidencialidad estará vigente durante todo el término de duración del </w:t>
-      </w:r>
-      <w:r>
-        <w:rPr>
-          <w:sz w:val="18"/>
-          <w:szCs w:val="18"/>
-          <w:lang w:val="es-CO"/>
-        </w:rPr>
-        <w:lastRenderedPageBreak/>
-        <w:t>presente convenio y se mantendrá hasta por dos (2) años adicionales contados a partir de la terminación del presente contrato.</w:t>
+        <w:t xml:space="preserve"> La presente cláusula de Confidencialidad estará vigente durante todo el término de duración del presente convenio y se mantendrá hasta por dos (2) años adicionales contados a partir de la terminación del presente contrato.</w:t>
       </w:r>
     </w:p>
     <w:p>
@@ -5005,7 +5072,7 @@
           <w:szCs w:val="18"/>
           <w:lang w:val="es-CO"/>
         </w:rPr>
-        <w:t xml:space="preserve">Conozco los derechos y las condiciones para el tratamiento de datos, incluyendo de manera enunciativa: a) Conocer íntegramente y de forma gratuita mis datos personales, así como actualizarlos y rectificarlos frente al EMPLEADOR o los encargados del tratamiento. b) Conocer el uso que se le ha dado a mis datos personales, previa solicitud al EMPLEADOR. e) Revocar la autorización y/o solicitar la supresión del dato cuando en el tratamiento no se respeten los principios, derechos y garantías constitucionales y legales. Al respecto, entiendo que la revocatoria y/o supresión procederá cuando la autoridad competente haya determinado que, en el tratamiento, EL EMPLEADOR o el encargado han incurrido en conductas </w:t>
+        <w:t xml:space="preserve">Conozco los derechos y las condiciones para el tratamiento de datos, incluyendo de manera enunciativa: a) Conocer íntegramente y de forma gratuita mis datos personales, así como actualizarlos y rectificarlos frente al EMPLEADOR o los encargados del tratamiento. b) Conocer el uso que se le ha dado a mis datos personales, previa solicitud al EMPLEADOR. e) Revocar la autorización y/o solicitar la supresión del dato cuando en el tratamiento no se respeten los principios, derechos y garantías constitucionales y legales. Al respecto, entiendo que la revocatoria y/o supresión procederá cuando la autoridad </w:t>
       </w:r>
       <w:r>
         <w:rPr>
@@ -5014,7 +5081,7 @@
           <w:lang w:val="es-CO"/>
         </w:rPr>
         <w:lastRenderedPageBreak/>
-        <w:t>contrarias a esta ley y a la Constitución Política. d) Para efectos de ejercer mis derechos a conocer, actualizar, rectificar y suprimir información, revocar la autorización, entre otros, podré acudir a EL EMPLEADOR como responsable. e) He sido informado acerca de la no obligatoriedad de las respuestas a las preguntas que me sean hechas, cuando éstas versen sobre datos sensibles, tales como origen racial o étnico, orientación política, convicciones religiosas o filosóficas, pertenencia a sindicatos, organizaciones sociales, de derechos humanos, datos relativos a la salud, a la vida sexual y los datos biométricos o sobre los datos de los niños, niñas y adolescentes. f) Me comprometo a guardar secreto sobre los datos de carácter personal y cualesquiera informaciones o circunstancias relativas a los clientes, usuarios y cualesquiera otras personas cuyos datos conozca y a los que haya tenido acceso en el ejercicio de las funciones que le hayan sido asignadas por EL EMPLEADOR.</w:t>
+        <w:t>competente haya determinado que, en el tratamiento, EL EMPLEADOR o el encargado han incurrido en conductas contrarias a esta ley y a la Constitución Política. d) Para efectos de ejercer mis derechos a conocer, actualizar, rectificar y suprimir información, revocar la autorización, entre otros, podré acudir a EL EMPLEADOR como responsable. e) He sido informado acerca de la no obligatoriedad de las respuestas a las preguntas que me sean hechas, cuando éstas versen sobre datos sensibles, tales como origen racial o étnico, orientación política, convicciones religiosas o filosóficas, pertenencia a sindicatos, organizaciones sociales, de derechos humanos, datos relativos a la salud, a la vida sexual y los datos biométricos o sobre los datos de los niños, niñas y adolescentes. f) Me comprometo a guardar secreto sobre los datos de carácter personal y cualesquiera informaciones o circunstancias relativas a los clientes, usuarios y cualesquiera otras personas cuyos datos conozca y a los que haya tenido acceso en el ejercicio de las funciones que le hayan sido asignadas por EL EMPLEADOR.</w:t>
       </w:r>
     </w:p>
     <w:p>
@@ -5382,6 +5449,7 @@
           <w:sz w:val="18"/>
           <w:szCs w:val="18"/>
         </w:rPr>
+        <w:lastRenderedPageBreak/>
         <w:t>POR EL EMPLEADOR</w:t>
       </w:r>
       <w:r>

</xml_diff>